<commit_message>
update test user details
</commit_message>
<xml_diff>
--- a/ReportsAndDocuments/installation Instructions.docx
+++ b/ReportsAndDocuments/installation Instructions.docx
@@ -3,11 +3,16 @@
 <w:document xmlns:wpc="http://schemas.microsoft.com/office/word/2010/wordprocessingCanvas" xmlns:cx="http://schemas.microsoft.com/office/drawing/2014/chartex" xmlns:cx1="http://schemas.microsoft.com/office/drawing/2015/9/8/chartex" xmlns:cx2="http://schemas.microsoft.com/office/drawing/2015/10/21/chartex" xmlns:cx3="http://schemas.microsoft.com/office/drawing/2016/5/9/chartex" xmlns:cx4="http://schemas.microsoft.com/office/drawing/2016/5/10/chartex" xmlns:cx5="http://schemas.microsoft.com/office/drawing/2016/5/11/chartex" xmlns:cx6="http://schemas.microsoft.com/office/drawing/2016/5/12/chartex" xmlns:cx7="http://schemas.microsoft.com/office/drawing/2016/5/13/chartex" xmlns:cx8="http://schemas.microsoft.com/office/drawing/2016/5/14/chartex" xmlns:mc="http://schemas.openxmlformats.org/markup-compatibility/2006" xmlns:aink="http://schemas.microsoft.com/office/drawing/2016/ink" xmlns:am3d="http://schemas.microsoft.com/office/drawing/2017/model3d" xmlns:o="urn:schemas-microsoft-com:office:office" xmlns:oel="http://schemas.microsoft.com/office/2019/extlst" xmlns:r="http://schemas.openxmlformats.org/officeDocument/2006/relationships" xmlns:m="http://schemas.openxmlformats.org/officeDocument/2006/math" xmlns:v="urn:schemas-microsoft-com:vml" xmlns:wp14="http://schemas.microsoft.com/office/word/2010/wordprocessingDrawing" xmlns:wp="http://schemas.openxmlformats.org/drawingml/2006/wordprocessingDrawing" xmlns:w10="urn:schemas-microsoft-com:office:word" xmlns:w="http://schemas.openxmlformats.org/wordprocessingml/2006/main" xmlns:w14="http://schemas.microsoft.com/office/word/2010/wordml" xmlns:w15="http://schemas.microsoft.com/office/word/2012/wordml" xmlns:w16cex="http://schemas.microsoft.com/office/word/2018/wordml/cex" xmlns:w16cid="http://schemas.microsoft.com/office/word/2016/wordml/cid" xmlns:w16="http://schemas.microsoft.com/office/word/2018/wordml" xmlns:w16sdtdh="http://schemas.microsoft.com/office/word/2020/wordml/sdtdatahash" xmlns:w16se="http://schemas.microsoft.com/office/word/2015/wordml/symex" xmlns:wpg="http://schemas.microsoft.com/office/word/2010/wordprocessingGroup" xmlns:wpi="http://schemas.microsoft.com/office/word/2010/wordprocessingInk" xmlns:wne="http://schemas.microsoft.com/office/word/2006/wordml" xmlns:wps="http://schemas.microsoft.com/office/word/2010/wordprocessingShape" mc:Ignorable="w14 w15 w16se w16cid w16 w16cex w16sdtdh wp14">
   <w:body>
     <w:p>
+      <w:proofErr w:type="gramStart"/>
       <w:r>
         <w:t>Repository</w:t>
       </w:r>
       <w:r>
-        <w:t xml:space="preserve"> : </w:t>
+        <w:t xml:space="preserve"> :</w:t>
+      </w:r>
+      <w:proofErr w:type="gramEnd"/>
+      <w:r>
+        <w:t xml:space="preserve"> </w:t>
       </w:r>
       <w:hyperlink r:id="rId5" w:history="1">
         <w:r>
@@ -51,9 +56,19 @@
       <w:r>
         <w:t xml:space="preserve">Cd </w:t>
       </w:r>
-      <w:r>
-        <w:t>FarmVendor\FarmVendor.Api</w:t>
-      </w:r>
+      <w:proofErr w:type="spellStart"/>
+      <w:r>
+        <w:t>FarmVendor</w:t>
+      </w:r>
+      <w:proofErr w:type="spellEnd"/>
+      <w:r>
+        <w:t>\</w:t>
+      </w:r>
+      <w:proofErr w:type="spellStart"/>
+      <w:r>
+        <w:t>FarmVendor.Api</w:t>
+      </w:r>
+      <w:proofErr w:type="spellEnd"/>
     </w:p>
     <w:p>
       <w:pPr>
@@ -92,7 +107,23 @@
           <w:b/>
           <w:bCs/>
         </w:rPr>
-        <w:t>.net db creation steps from migration files</w:t>
+        <w:t xml:space="preserve">.net </w:t>
+      </w:r>
+      <w:proofErr w:type="spellStart"/>
+      <w:r>
+        <w:rPr>
+          <w:b/>
+          <w:bCs/>
+        </w:rPr>
+        <w:t>db</w:t>
+      </w:r>
+      <w:proofErr w:type="spellEnd"/>
+      <w:r>
+        <w:rPr>
+          <w:b/>
+          <w:bCs/>
+        </w:rPr>
+        <w:t xml:space="preserve"> creation steps from migration files</w:t>
       </w:r>
     </w:p>
     <w:p>
@@ -108,8 +139,17 @@
           <w:b/>
           <w:bCs/>
         </w:rPr>
-        <w:t>dotnet tool install --global dotnet-ef</w:t>
-      </w:r>
+        <w:t>dotnet tool install --global dotnet-</w:t>
+      </w:r>
+      <w:proofErr w:type="spellStart"/>
+      <w:r>
+        <w:rPr>
+          <w:b/>
+          <w:bCs/>
+        </w:rPr>
+        <w:t>ef</w:t>
+      </w:r>
+      <w:proofErr w:type="spellEnd"/>
       <w:r>
         <w:t xml:space="preserve">  </w:t>
       </w:r>
@@ -127,7 +167,23 @@
           <w:b/>
           <w:bCs/>
         </w:rPr>
-        <w:t>dotnet ef database update</w:t>
+        <w:t xml:space="preserve">dotnet </w:t>
+      </w:r>
+      <w:proofErr w:type="spellStart"/>
+      <w:r>
+        <w:rPr>
+          <w:b/>
+          <w:bCs/>
+        </w:rPr>
+        <w:t>ef</w:t>
+      </w:r>
+      <w:proofErr w:type="spellEnd"/>
+      <w:r>
+        <w:rPr>
+          <w:b/>
+          <w:bCs/>
+        </w:rPr>
+        <w:t xml:space="preserve"> database update</w:t>
       </w:r>
     </w:p>
     <w:p>
@@ -173,8 +229,13 @@
       <w:r>
         <w:t xml:space="preserve">Cd </w:t>
       </w:r>
-      <w:r>
-        <w:t>farmvendor-web</w:t>
+      <w:proofErr w:type="spellStart"/>
+      <w:r>
+        <w:t>farmvendor</w:t>
+      </w:r>
+      <w:proofErr w:type="spellEnd"/>
+      <w:r>
+        <w:t>-web</w:t>
       </w:r>
     </w:p>
     <w:p>
@@ -186,8 +247,13 @@
         </w:numPr>
       </w:pPr>
       <w:bookmarkStart w:id="0" w:name="_Hlk222746674"/>
-      <w:r>
-        <w:t>Npm install</w:t>
+      <w:proofErr w:type="spellStart"/>
+      <w:r>
+        <w:t>Npm</w:t>
+      </w:r>
+      <w:proofErr w:type="spellEnd"/>
+      <w:r>
+        <w:t xml:space="preserve"> install</w:t>
       </w:r>
     </w:p>
     <w:bookmarkEnd w:id="0"/>
@@ -199,8 +265,13 @@
           <w:numId w:val="3"/>
         </w:numPr>
       </w:pPr>
-      <w:r>
-        <w:t>npm run dev</w:t>
+      <w:proofErr w:type="spellStart"/>
+      <w:r>
+        <w:t>npm</w:t>
+      </w:r>
+      <w:proofErr w:type="spellEnd"/>
+      <w:r>
+        <w:t xml:space="preserve"> run dev</w:t>
       </w:r>
       <w:r>
         <w:t xml:space="preserve">  </w:t>
@@ -215,7 +286,15 @@
         </w:numPr>
       </w:pPr>
       <w:r>
-        <w:t>Create .env file inside farmvendor-web and paste below content</w:t>
+        <w:t xml:space="preserve">Create .env file inside </w:t>
+      </w:r>
+      <w:proofErr w:type="spellStart"/>
+      <w:r>
+        <w:t>farmvendor</w:t>
+      </w:r>
+      <w:proofErr w:type="spellEnd"/>
+      <w:r>
+        <w:t>-web and paste below content</w:t>
       </w:r>
     </w:p>
     <w:p>
@@ -269,7 +348,23 @@
           <w:b/>
           <w:bCs/>
         </w:rPr>
-        <w:t>SQL Server (mssql)</w:t>
+        <w:t>SQL Server (</w:t>
+      </w:r>
+      <w:proofErr w:type="spellStart"/>
+      <w:r>
+        <w:rPr>
+          <w:b/>
+          <w:bCs/>
+        </w:rPr>
+        <w:t>mssql</w:t>
+      </w:r>
+      <w:proofErr w:type="spellEnd"/>
+      <w:r>
+        <w:rPr>
+          <w:b/>
+          <w:bCs/>
+        </w:rPr>
+        <w:t>)</w:t>
       </w:r>
       <w:r>
         <w:rPr>
@@ -346,8 +441,33 @@
           <w:b/>
           <w:bCs/>
         </w:rPr>
-        <w:t>(localdb)\MSSQLLocalDB</w:t>
-      </w:r>
+        <w:t>(</w:t>
+      </w:r>
+      <w:proofErr w:type="spellStart"/>
+      <w:r>
+        <w:rPr>
+          <w:b/>
+          <w:bCs/>
+        </w:rPr>
+        <w:t>localdb</w:t>
+      </w:r>
+      <w:proofErr w:type="spellEnd"/>
+      <w:r>
+        <w:rPr>
+          <w:b/>
+          <w:bCs/>
+        </w:rPr>
+        <w:t>)\</w:t>
+      </w:r>
+      <w:proofErr w:type="spellStart"/>
+      <w:r>
+        <w:rPr>
+          <w:b/>
+          <w:bCs/>
+        </w:rPr>
+        <w:t>MSSQLLocalDB</w:t>
+      </w:r>
+      <w:proofErr w:type="spellEnd"/>
     </w:p>
     <w:p>
       <w:pPr>
@@ -396,8 +516,17 @@
           <w:b/>
           <w:bCs/>
         </w:rPr>
-        <w:t>Trust server certificate :yes</w:t>
-      </w:r>
+        <w:t xml:space="preserve">Trust server </w:t>
+      </w:r>
+      <w:proofErr w:type="gramStart"/>
+      <w:r>
+        <w:rPr>
+          <w:b/>
+          <w:bCs/>
+        </w:rPr>
+        <w:t>certificate :yes</w:t>
+      </w:r>
+      <w:proofErr w:type="gramEnd"/>
     </w:p>
     <w:p>
       <w:pPr>
@@ -415,8 +544,220 @@
         <w:t xml:space="preserve"> </w:t>
       </w:r>
       <w:r>
-        <w:t>See database via sql queries folder inside reports and documents folder</w:t>
-      </w:r>
+        <w:t xml:space="preserve">See database via </w:t>
+      </w:r>
+      <w:proofErr w:type="spellStart"/>
+      <w:r>
+        <w:t>sql</w:t>
+      </w:r>
+      <w:proofErr w:type="spellEnd"/>
+      <w:r>
+        <w:t xml:space="preserve"> queries folder inside reports and documents folder</w:t>
+      </w:r>
+    </w:p>
+    <w:p>
+      <w:pPr>
+        <w:pStyle w:val="ListParagraph"/>
+        <w:numPr>
+          <w:ilvl w:val="1"/>
+          <w:numId w:val="8"/>
+        </w:numPr>
+        <w:rPr>
+          <w:b/>
+          <w:bCs/>
+        </w:rPr>
+      </w:pPr>
+      <w:r>
+        <w:t xml:space="preserve">Website </w:t>
+      </w:r>
+      <w:proofErr w:type="spellStart"/>
+      <w:proofErr w:type="gramStart"/>
+      <w:r>
+        <w:t>url</w:t>
+      </w:r>
+      <w:proofErr w:type="spellEnd"/>
+      <w:r>
+        <w:t xml:space="preserve"> :</w:t>
+      </w:r>
+      <w:proofErr w:type="gramEnd"/>
+      <w:r>
+        <w:t xml:space="preserve"> </w:t>
+      </w:r>
+      <w:hyperlink r:id="rId6" w:history="1">
+        <w:r>
+          <w:rPr>
+            <w:rStyle w:val="Hyperlink"/>
+          </w:rPr>
+          <w:t>http://localhost:5173/</w:t>
+        </w:r>
+      </w:hyperlink>
+    </w:p>
+    <w:p>
+      <w:pPr>
+        <w:pStyle w:val="ListParagraph"/>
+        <w:numPr>
+          <w:ilvl w:val="1"/>
+          <w:numId w:val="8"/>
+        </w:numPr>
+        <w:rPr>
+          <w:b/>
+          <w:bCs/>
+        </w:rPr>
+      </w:pPr>
+      <w:r>
+        <w:t xml:space="preserve">Test </w:t>
+      </w:r>
+      <w:proofErr w:type="gramStart"/>
+      <w:r>
+        <w:t>user :farmer</w:t>
+      </w:r>
+      <w:proofErr w:type="gramEnd"/>
+    </w:p>
+    <w:p>
+      <w:pPr>
+        <w:pStyle w:val="ListParagraph"/>
+        <w:ind w:left="1080"/>
+      </w:pPr>
+      <w:r>
+        <w:tab/>
+      </w:r>
+      <w:proofErr w:type="gramStart"/>
+      <w:r>
+        <w:t>Username :</w:t>
+      </w:r>
+      <w:proofErr w:type="gramEnd"/>
+      <w:r>
+        <w:t xml:space="preserve"> </w:t>
+      </w:r>
+      <w:hyperlink r:id="rId7" w:history="1">
+        <w:r>
+          <w:rPr>
+            <w:rStyle w:val="Hyperlink"/>
+          </w:rPr>
+          <w:t>farmer1@test.com</w:t>
+        </w:r>
+      </w:hyperlink>
+    </w:p>
+    <w:p>
+      <w:pPr>
+        <w:pStyle w:val="ListParagraph"/>
+        <w:ind w:left="1080"/>
+      </w:pPr>
+      <w:r>
+        <w:tab/>
+      </w:r>
+      <w:proofErr w:type="gramStart"/>
+      <w:r>
+        <w:t>Password :</w:t>
+      </w:r>
+      <w:proofErr w:type="gramEnd"/>
+      <w:r>
+        <w:t xml:space="preserve"> </w:t>
+      </w:r>
+      <w:r>
+        <w:t>Test@123</w:t>
+      </w:r>
+    </w:p>
+    <w:p>
+      <w:pPr>
+        <w:pStyle w:val="ListParagraph"/>
+        <w:numPr>
+          <w:ilvl w:val="1"/>
+          <w:numId w:val="8"/>
+        </w:numPr>
+        <w:rPr>
+          <w:b/>
+          <w:bCs/>
+        </w:rPr>
+      </w:pPr>
+      <w:r>
+        <w:rPr>
+          <w:b/>
+          <w:bCs/>
+        </w:rPr>
+        <w:t xml:space="preserve">Test </w:t>
+      </w:r>
+      <w:proofErr w:type="gramStart"/>
+      <w:r>
+        <w:rPr>
+          <w:b/>
+          <w:bCs/>
+        </w:rPr>
+        <w:t>user :</w:t>
+      </w:r>
+      <w:proofErr w:type="gramEnd"/>
+      <w:r>
+        <w:rPr>
+          <w:b/>
+          <w:bCs/>
+        </w:rPr>
+        <w:t xml:space="preserve"> Vendor</w:t>
+      </w:r>
+    </w:p>
+    <w:p>
+      <w:pPr>
+        <w:pStyle w:val="ListParagraph"/>
+        <w:ind w:left="1080"/>
+      </w:pPr>
+      <w:r>
+        <w:rPr>
+          <w:b/>
+          <w:bCs/>
+        </w:rPr>
+        <w:tab/>
+      </w:r>
+      <w:proofErr w:type="gramStart"/>
+      <w:r>
+        <w:t>Username :</w:t>
+      </w:r>
+      <w:proofErr w:type="gramEnd"/>
+      <w:r>
+        <w:t xml:space="preserve"> </w:t>
+      </w:r>
+      <w:hyperlink r:id="rId8" w:history="1">
+        <w:r>
+          <w:rPr>
+            <w:rStyle w:val="Hyperlink"/>
+          </w:rPr>
+          <w:t>vendor</w:t>
+        </w:r>
+        <w:r>
+          <w:rPr>
+            <w:rStyle w:val="Hyperlink"/>
+          </w:rPr>
+          <w:t>1@test.com</w:t>
+        </w:r>
+      </w:hyperlink>
+    </w:p>
+    <w:p>
+      <w:pPr>
+        <w:pStyle w:val="ListParagraph"/>
+        <w:ind w:left="1080"/>
+      </w:pPr>
+      <w:r>
+        <w:tab/>
+      </w:r>
+      <w:proofErr w:type="gramStart"/>
+      <w:r>
+        <w:t>Password :</w:t>
+      </w:r>
+      <w:proofErr w:type="gramEnd"/>
+      <w:r>
+        <w:t xml:space="preserve"> </w:t>
+      </w:r>
+      <w:r>
+        <w:t>Test@123</w:t>
+      </w:r>
+    </w:p>
+    <w:p>
+      <w:pPr>
+        <w:pStyle w:val="ListParagraph"/>
+        <w:ind w:left="1080"/>
+        <w:rPr>
+          <w:b/>
+          <w:bCs/>
+        </w:rPr>
+      </w:pPr>
       <w:r>
         <w:rPr>
           <w:b/>
@@ -2236,6 +2577,18 @@
       <w:u w:val="single"/>
     </w:rPr>
   </w:style>
+  <w:style w:type="character" w:styleId="UnresolvedMention">
+    <w:name w:val="Unresolved Mention"/>
+    <w:basedOn w:val="DefaultParagraphFont"/>
+    <w:uiPriority w:val="99"/>
+    <w:semiHidden/>
+    <w:unhideWhenUsed/>
+    <w:rsid w:val="00D02648"/>
+    <w:rPr>
+      <w:color w:val="605E5C"/>
+      <w:shd w:val="clear" w:color="auto" w:fill="E1DFDD"/>
+    </w:rPr>
+  </w:style>
 </w:styles>
 </file>
 

</xml_diff>

<commit_message>
import product image for adding new product functionality
</commit_message>
<xml_diff>
--- a/ReportsAndDocuments/installation Instructions.docx
+++ b/ReportsAndDocuments/installation Instructions.docx
@@ -3,16 +3,11 @@
 <w:document xmlns:wpc="http://schemas.microsoft.com/office/word/2010/wordprocessingCanvas" xmlns:cx="http://schemas.microsoft.com/office/drawing/2014/chartex" xmlns:cx1="http://schemas.microsoft.com/office/drawing/2015/9/8/chartex" xmlns:cx2="http://schemas.microsoft.com/office/drawing/2015/10/21/chartex" xmlns:cx3="http://schemas.microsoft.com/office/drawing/2016/5/9/chartex" xmlns:cx4="http://schemas.microsoft.com/office/drawing/2016/5/10/chartex" xmlns:cx5="http://schemas.microsoft.com/office/drawing/2016/5/11/chartex" xmlns:cx6="http://schemas.microsoft.com/office/drawing/2016/5/12/chartex" xmlns:cx7="http://schemas.microsoft.com/office/drawing/2016/5/13/chartex" xmlns:cx8="http://schemas.microsoft.com/office/drawing/2016/5/14/chartex" xmlns:mc="http://schemas.openxmlformats.org/markup-compatibility/2006" xmlns:aink="http://schemas.microsoft.com/office/drawing/2016/ink" xmlns:am3d="http://schemas.microsoft.com/office/drawing/2017/model3d" xmlns:o="urn:schemas-microsoft-com:office:office" xmlns:oel="http://schemas.microsoft.com/office/2019/extlst" xmlns:r="http://schemas.openxmlformats.org/officeDocument/2006/relationships" xmlns:m="http://schemas.openxmlformats.org/officeDocument/2006/math" xmlns:v="urn:schemas-microsoft-com:vml" xmlns:wp14="http://schemas.microsoft.com/office/word/2010/wordprocessingDrawing" xmlns:wp="http://schemas.openxmlformats.org/drawingml/2006/wordprocessingDrawing" xmlns:w10="urn:schemas-microsoft-com:office:word" xmlns:w="http://schemas.openxmlformats.org/wordprocessingml/2006/main" xmlns:w14="http://schemas.microsoft.com/office/word/2010/wordml" xmlns:w15="http://schemas.microsoft.com/office/word/2012/wordml" xmlns:w16cex="http://schemas.microsoft.com/office/word/2018/wordml/cex" xmlns:w16cid="http://schemas.microsoft.com/office/word/2016/wordml/cid" xmlns:w16="http://schemas.microsoft.com/office/word/2018/wordml" xmlns:w16sdtdh="http://schemas.microsoft.com/office/word/2020/wordml/sdtdatahash" xmlns:w16se="http://schemas.microsoft.com/office/word/2015/wordml/symex" xmlns:wpg="http://schemas.microsoft.com/office/word/2010/wordprocessingGroup" xmlns:wpi="http://schemas.microsoft.com/office/word/2010/wordprocessingInk" xmlns:wne="http://schemas.microsoft.com/office/word/2006/wordml" xmlns:wps="http://schemas.microsoft.com/office/word/2010/wordprocessingShape" mc:Ignorable="w14 w15 w16se w16cid w16 w16cex w16sdtdh wp14">
   <w:body>
     <w:p>
-      <w:proofErr w:type="gramStart"/>
       <w:r>
         <w:t>Repository</w:t>
       </w:r>
       <w:r>
-        <w:t xml:space="preserve"> :</w:t>
-      </w:r>
-      <w:proofErr w:type="gramEnd"/>
-      <w:r>
-        <w:t xml:space="preserve"> </w:t>
+        <w:t xml:space="preserve"> : </w:t>
       </w:r>
       <w:hyperlink r:id="rId5" w:history="1">
         <w:r>
@@ -56,19 +51,9 @@
       <w:r>
         <w:t xml:space="preserve">Cd </w:t>
       </w:r>
-      <w:proofErr w:type="spellStart"/>
-      <w:r>
-        <w:t>FarmVendor</w:t>
-      </w:r>
-      <w:proofErr w:type="spellEnd"/>
-      <w:r>
-        <w:t>\</w:t>
-      </w:r>
-      <w:proofErr w:type="spellStart"/>
-      <w:r>
-        <w:t>FarmVendor.Api</w:t>
-      </w:r>
-      <w:proofErr w:type="spellEnd"/>
+      <w:r>
+        <w:t>FarmVendor\FarmVendor.Api</w:t>
+      </w:r>
     </w:p>
     <w:p>
       <w:pPr>
@@ -107,23 +92,7 @@
           <w:b/>
           <w:bCs/>
         </w:rPr>
-        <w:t xml:space="preserve">.net </w:t>
-      </w:r>
-      <w:proofErr w:type="spellStart"/>
-      <w:r>
-        <w:rPr>
-          <w:b/>
-          <w:bCs/>
-        </w:rPr>
-        <w:t>db</w:t>
-      </w:r>
-      <w:proofErr w:type="spellEnd"/>
-      <w:r>
-        <w:rPr>
-          <w:b/>
-          <w:bCs/>
-        </w:rPr>
-        <w:t xml:space="preserve"> creation steps from migration files</w:t>
+        <w:t>.net db creation steps from migration files</w:t>
       </w:r>
     </w:p>
     <w:p>
@@ -135,17 +104,8 @@
           <w:b/>
           <w:bCs/>
         </w:rPr>
-        <w:t>dotnet tool install --global dotnet-</w:t>
-      </w:r>
-      <w:proofErr w:type="spellStart"/>
-      <w:r>
-        <w:rPr>
-          <w:b/>
-          <w:bCs/>
-        </w:rPr>
-        <w:t>ef</w:t>
-      </w:r>
-      <w:proofErr w:type="spellEnd"/>
+        <w:t>dotnet tool install --global dotnet-ef</w:t>
+      </w:r>
       <w:r>
         <w:t xml:space="preserve">  </w:t>
       </w:r>
@@ -155,26 +115,11 @@
         <w:ind w:left="1080"/>
       </w:pPr>
       <w:r>
-        <w:t xml:space="preserve">dotnet </w:t>
-      </w:r>
-      <w:proofErr w:type="spellStart"/>
-      <w:r>
-        <w:t>ef</w:t>
-      </w:r>
-      <w:proofErr w:type="spellEnd"/>
-      <w:r>
-        <w:t xml:space="preserve"> migrations add </w:t>
-      </w:r>
-      <w:proofErr w:type="spellStart"/>
-      <w:proofErr w:type="gramStart"/>
-      <w:r>
-        <w:t>AddChatModule</w:t>
-      </w:r>
-      <w:proofErr w:type="spellEnd"/>
+        <w:t>dotnet ef migrations add AddChatModule</w:t>
+      </w:r>
       <w:r>
         <w:t>(</w:t>
       </w:r>
-      <w:proofErr w:type="gramEnd"/>
       <w:r>
         <w:rPr>
           <w:b/>
@@ -199,40 +144,27 @@
         <w:ind w:left="1080"/>
       </w:pPr>
       <w:r>
-        <w:t xml:space="preserve">dotnet add package </w:t>
-      </w:r>
-      <w:proofErr w:type="spellStart"/>
-      <w:r>
-        <w:t>Microsoft.ML.TimeSeries</w:t>
-      </w:r>
-      <w:proofErr w:type="spellEnd"/>
+        <w:t>dotnet add package Microsoft.ML.TimeSeries</w:t>
+      </w:r>
     </w:p>
     <w:p>
       <w:pPr>
         <w:ind w:left="1080"/>
       </w:pPr>
       <w:r>
-        <w:rPr>
-          <w:b/>
-          <w:bCs/>
-        </w:rPr>
-        <w:t xml:space="preserve">dotnet </w:t>
-      </w:r>
-      <w:proofErr w:type="spellStart"/>
-      <w:r>
-        <w:rPr>
-          <w:b/>
-          <w:bCs/>
-        </w:rPr>
-        <w:t>ef</w:t>
-      </w:r>
-      <w:proofErr w:type="spellEnd"/>
-      <w:r>
-        <w:rPr>
-          <w:b/>
-          <w:bCs/>
-        </w:rPr>
-        <w:t xml:space="preserve"> database update</w:t>
+        <w:t>dotnet ef migrations add AddProductImageFields</w:t>
+      </w:r>
+    </w:p>
+    <w:p>
+      <w:pPr>
+        <w:ind w:left="1080"/>
+      </w:pPr>
+      <w:r>
+        <w:rPr>
+          <w:b/>
+          <w:bCs/>
+        </w:rPr>
+        <w:t>dotnet ef database update</w:t>
       </w:r>
     </w:p>
     <w:p>
@@ -294,13 +226,8 @@
       <w:r>
         <w:t xml:space="preserve">Cd </w:t>
       </w:r>
-      <w:proofErr w:type="spellStart"/>
-      <w:r>
-        <w:t>farmvendor</w:t>
-      </w:r>
-      <w:proofErr w:type="spellEnd"/>
-      <w:r>
-        <w:t>-web</w:t>
+      <w:r>
+        <w:t>farmvendor-web</w:t>
       </w:r>
     </w:p>
     <w:p>
@@ -312,13 +239,8 @@
         </w:numPr>
       </w:pPr>
       <w:bookmarkStart w:id="0" w:name="_Hlk222746674"/>
-      <w:proofErr w:type="spellStart"/>
-      <w:r>
-        <w:t>Npm</w:t>
-      </w:r>
-      <w:proofErr w:type="spellEnd"/>
-      <w:r>
-        <w:t xml:space="preserve"> install</w:t>
+      <w:r>
+        <w:t>Npm install</w:t>
       </w:r>
     </w:p>
     <w:p>
@@ -329,13 +251,8 @@
           <w:numId w:val="3"/>
         </w:numPr>
       </w:pPr>
-      <w:proofErr w:type="spellStart"/>
-      <w:r>
-        <w:t>npm</w:t>
-      </w:r>
-      <w:proofErr w:type="spellEnd"/>
-      <w:r>
-        <w:t xml:space="preserve"> install react-chartjs-2 chart.js</w:t>
+      <w:r>
+        <w:t>npm install react-chartjs-2 chart.js</w:t>
       </w:r>
     </w:p>
     <w:p>
@@ -346,13 +263,8 @@
           <w:numId w:val="3"/>
         </w:numPr>
       </w:pPr>
-      <w:proofErr w:type="spellStart"/>
-      <w:r>
-        <w:t>npm</w:t>
-      </w:r>
-      <w:proofErr w:type="spellEnd"/>
-      <w:r>
-        <w:t xml:space="preserve"> install @microsoft/signalr</w:t>
+      <w:r>
+        <w:t>npm install @microsoft/signalr</w:t>
       </w:r>
     </w:p>
     <w:bookmarkEnd w:id="0"/>
@@ -364,13 +276,8 @@
           <w:numId w:val="3"/>
         </w:numPr>
       </w:pPr>
-      <w:proofErr w:type="spellStart"/>
-      <w:r>
-        <w:t>npm</w:t>
-      </w:r>
-      <w:proofErr w:type="spellEnd"/>
-      <w:r>
-        <w:t xml:space="preserve"> run dev</w:t>
+      <w:r>
+        <w:t>npm run dev</w:t>
       </w:r>
       <w:r>
         <w:t xml:space="preserve">  </w:t>
@@ -385,15 +292,7 @@
         </w:numPr>
       </w:pPr>
       <w:r>
-        <w:t xml:space="preserve">Create .env file inside </w:t>
-      </w:r>
-      <w:proofErr w:type="spellStart"/>
-      <w:r>
-        <w:t>farmvendor</w:t>
-      </w:r>
-      <w:proofErr w:type="spellEnd"/>
-      <w:r>
-        <w:t>-web and paste below content</w:t>
+        <w:t>Create .env file inside farmvendor-web and paste below content</w:t>
       </w:r>
     </w:p>
     <w:p>
@@ -444,23 +343,7 @@
           <w:b/>
           <w:bCs/>
         </w:rPr>
-        <w:t>SQL Server (</w:t>
-      </w:r>
-      <w:proofErr w:type="spellStart"/>
-      <w:r>
-        <w:rPr>
-          <w:b/>
-          <w:bCs/>
-        </w:rPr>
-        <w:t>mssql</w:t>
-      </w:r>
-      <w:proofErr w:type="spellEnd"/>
-      <w:r>
-        <w:rPr>
-          <w:b/>
-          <w:bCs/>
-        </w:rPr>
-        <w:t>)</w:t>
+        <w:t>SQL Server (mssql)</w:t>
       </w:r>
       <w:r>
         <w:rPr>
@@ -537,33 +420,8 @@
           <w:b/>
           <w:bCs/>
         </w:rPr>
-        <w:t>(</w:t>
-      </w:r>
-      <w:proofErr w:type="spellStart"/>
-      <w:r>
-        <w:rPr>
-          <w:b/>
-          <w:bCs/>
-        </w:rPr>
-        <w:t>localdb</w:t>
-      </w:r>
-      <w:proofErr w:type="spellEnd"/>
-      <w:r>
-        <w:rPr>
-          <w:b/>
-          <w:bCs/>
-        </w:rPr>
-        <w:t>)\</w:t>
-      </w:r>
-      <w:proofErr w:type="spellStart"/>
-      <w:r>
-        <w:rPr>
-          <w:b/>
-          <w:bCs/>
-        </w:rPr>
-        <w:t>MSSQLLocalDB</w:t>
-      </w:r>
-      <w:proofErr w:type="spellEnd"/>
+        <w:t>(localdb)\MSSQLLocalDB</w:t>
+      </w:r>
     </w:p>
     <w:p>
       <w:pPr>
@@ -612,17 +470,8 @@
           <w:b/>
           <w:bCs/>
         </w:rPr>
-        <w:t xml:space="preserve">Trust server </w:t>
-      </w:r>
-      <w:proofErr w:type="gramStart"/>
-      <w:r>
-        <w:rPr>
-          <w:b/>
-          <w:bCs/>
-        </w:rPr>
-        <w:t>certificate :yes</w:t>
-      </w:r>
-      <w:proofErr w:type="gramEnd"/>
+        <w:t>Trust server certificate :yes</w:t>
+      </w:r>
     </w:p>
     <w:p>
       <w:pPr>
@@ -642,21 +491,12 @@
       <w:r>
         <w:t xml:space="preserve">See database via </w:t>
       </w:r>
-      <w:proofErr w:type="spellStart"/>
-      <w:r>
-        <w:rPr>
-          <w:b/>
-          <w:bCs/>
-        </w:rPr>
-        <w:t>sql</w:t>
-      </w:r>
-      <w:proofErr w:type="spellEnd"/>
-      <w:r>
-        <w:rPr>
-          <w:b/>
-          <w:bCs/>
-        </w:rPr>
-        <w:t xml:space="preserve"> queries</w:t>
+      <w:r>
+        <w:rPr>
+          <w:b/>
+          <w:bCs/>
+        </w:rPr>
+        <w:t>sql queries</w:t>
       </w:r>
       <w:r>
         <w:t xml:space="preserve"> folder inside reports and documents folder</w:t>
@@ -675,20 +515,8 @@
         </w:rPr>
       </w:pPr>
       <w:r>
-        <w:t xml:space="preserve">Website </w:t>
-      </w:r>
-      <w:proofErr w:type="spellStart"/>
-      <w:proofErr w:type="gramStart"/>
-      <w:r>
-        <w:t>url</w:t>
-      </w:r>
-      <w:proofErr w:type="spellEnd"/>
-      <w:r>
-        <w:t xml:space="preserve"> :</w:t>
-      </w:r>
-      <w:proofErr w:type="gramEnd"/>
-      <w:r>
-        <w:t xml:space="preserve"> </w:t>
+        <w:lastRenderedPageBreak/>
+        <w:t xml:space="preserve">Website url : </w:t>
       </w:r>
       <w:hyperlink r:id="rId6" w:history="1">
         <w:r>
@@ -712,13 +540,8 @@
         </w:rPr>
       </w:pPr>
       <w:r>
-        <w:t xml:space="preserve">Test </w:t>
-      </w:r>
-      <w:proofErr w:type="gramStart"/>
-      <w:r>
-        <w:t>user :farmer</w:t>
-      </w:r>
-      <w:proofErr w:type="gramEnd"/>
+        <w:t>Test user :farmer</w:t>
+      </w:r>
     </w:p>
     <w:p>
       <w:pPr>
@@ -726,16 +549,8 @@
         <w:ind w:left="1080"/>
       </w:pPr>
       <w:r>
-        <w:lastRenderedPageBreak/>
         <w:tab/>
-      </w:r>
-      <w:proofErr w:type="gramStart"/>
-      <w:r>
-        <w:t>Username :</w:t>
-      </w:r>
-      <w:proofErr w:type="gramEnd"/>
-      <w:r>
-        <w:t xml:space="preserve"> </w:t>
+        <w:t xml:space="preserve">Username : </w:t>
       </w:r>
       <w:hyperlink r:id="rId7" w:history="1">
         <w:r>
@@ -753,14 +568,7 @@
       </w:pPr>
       <w:r>
         <w:tab/>
-      </w:r>
-      <w:proofErr w:type="gramStart"/>
-      <w:r>
-        <w:t>Password :</w:t>
-      </w:r>
-      <w:proofErr w:type="gramEnd"/>
-      <w:r>
-        <w:t xml:space="preserve"> </w:t>
+        <w:t xml:space="preserve">Password : </w:t>
       </w:r>
       <w:r>
         <w:t>Test@123</w:t>
@@ -783,23 +591,7 @@
           <w:b/>
           <w:bCs/>
         </w:rPr>
-        <w:t xml:space="preserve">Test </w:t>
-      </w:r>
-      <w:proofErr w:type="gramStart"/>
-      <w:r>
-        <w:rPr>
-          <w:b/>
-          <w:bCs/>
-        </w:rPr>
-        <w:t>user :</w:t>
-      </w:r>
-      <w:proofErr w:type="gramEnd"/>
-      <w:r>
-        <w:rPr>
-          <w:b/>
-          <w:bCs/>
-        </w:rPr>
-        <w:t xml:space="preserve"> Vendor</w:t>
+        <w:t>Test user : Vendor</w:t>
       </w:r>
     </w:p>
     <w:p>
@@ -814,13 +606,8 @@
         </w:rPr>
         <w:tab/>
       </w:r>
-      <w:proofErr w:type="gramStart"/>
-      <w:r>
-        <w:t>Username :</w:t>
-      </w:r>
-      <w:proofErr w:type="gramEnd"/>
-      <w:r>
-        <w:t xml:space="preserve"> </w:t>
+      <w:r>
+        <w:t xml:space="preserve">Username : </w:t>
       </w:r>
       <w:hyperlink r:id="rId8" w:history="1">
         <w:r>
@@ -838,14 +625,7 @@
       </w:pPr>
       <w:r>
         <w:tab/>
-      </w:r>
-      <w:proofErr w:type="gramStart"/>
-      <w:r>
-        <w:t>Password :</w:t>
-      </w:r>
-      <w:proofErr w:type="gramEnd"/>
-      <w:r>
-        <w:t xml:space="preserve"> </w:t>
+        <w:t xml:space="preserve">Password : </w:t>
       </w:r>
       <w:r>
         <w:t>Test@123</w:t>
@@ -2478,7 +2258,6 @@
   <w:style w:type="character" w:default="1" w:styleId="DefaultParagraphFont">
     <w:name w:val="Default Paragraph Font"/>
     <w:uiPriority w:val="1"/>
-    <w:semiHidden/>
     <w:unhideWhenUsed/>
   </w:style>
   <w:style w:type="table" w:default="1" w:styleId="TableNormal">

</xml_diff>

<commit_message>
product images done farmer
</commit_message>
<xml_diff>
--- a/ReportsAndDocuments/installation Instructions.docx
+++ b/ReportsAndDocuments/installation Instructions.docx
@@ -267,7 +267,6 @@
         <w:t>npm install @microsoft/signalr</w:t>
       </w:r>
     </w:p>
-    <w:bookmarkEnd w:id="0"/>
     <w:p>
       <w:pPr>
         <w:pStyle w:val="ListParagraph"/>
@@ -277,12 +276,10 @@
         </w:numPr>
       </w:pPr>
       <w:r>
-        <w:t>npm run dev</w:t>
-      </w:r>
-      <w:r>
-        <w:t xml:space="preserve">  </w:t>
-      </w:r>
-    </w:p>
+        <w:t>npm install react-select</w:t>
+      </w:r>
+    </w:p>
+    <w:bookmarkEnd w:id="0"/>
     <w:p>
       <w:pPr>
         <w:pStyle w:val="ListParagraph"/>
@@ -292,6 +289,21 @@
         </w:numPr>
       </w:pPr>
       <w:r>
+        <w:t>npm run dev</w:t>
+      </w:r>
+      <w:r>
+        <w:t xml:space="preserve">  </w:t>
+      </w:r>
+    </w:p>
+    <w:p>
+      <w:pPr>
+        <w:pStyle w:val="ListParagraph"/>
+        <w:numPr>
+          <w:ilvl w:val="0"/>
+          <w:numId w:val="3"/>
+        </w:numPr>
+      </w:pPr>
+      <w:r>
         <w:t>Create .env file inside farmvendor-web and paste below content</w:t>
       </w:r>
     </w:p>
@@ -486,6 +498,7 @@
         </w:rPr>
       </w:pPr>
       <w:r>
+        <w:lastRenderedPageBreak/>
         <w:t xml:space="preserve"> </w:t>
       </w:r>
       <w:r>
@@ -515,7 +528,6 @@
         </w:rPr>
       </w:pPr>
       <w:r>
-        <w:lastRenderedPageBreak/>
         <w:t xml:space="preserve">Website url : </w:t>
       </w:r>
       <w:hyperlink r:id="rId6" w:history="1">

</xml_diff>